<commit_message>
Continued Course mongoDB CRUD Insert Theme
</commit_message>
<xml_diff>
--- a/Documentation mongoDB.docx
+++ b/Documentation mongoDB.docx
@@ -10491,7 +10491,8 @@
       </w:pPr>
       <w:r>
         <w:rPr>
-          <w:lang w:val="es-CO"/>
+          <w:noProof/>
+          <w:lang w:val="en-US" w:eastAsia="en-US"/>
         </w:rPr>
         <w:drawing>
           <wp:inline distT="0" distB="0" distL="0" distR="0" wp14:anchorId="456FA0F3" wp14:editId="667E702E">
@@ -10539,7 +10540,8 @@
       </w:pPr>
       <w:r>
         <w:rPr>
-          <w:lang w:val="es-CO"/>
+          <w:noProof/>
+          <w:lang w:val="en-US" w:eastAsia="en-US"/>
         </w:rPr>
         <w:lastRenderedPageBreak/>
         <w:drawing>
@@ -10636,7 +10638,8 @@
       </w:pPr>
       <w:r>
         <w:rPr>
-          <w:lang w:val="es-CO"/>
+          <w:noProof/>
+          <w:lang w:val="en-US" w:eastAsia="en-US"/>
         </w:rPr>
         <w:drawing>
           <wp:inline distT="0" distB="0" distL="0" distR="0" wp14:anchorId="49647BD7" wp14:editId="2EEFB688">
@@ -10697,7 +10700,8 @@
       </w:pPr>
       <w:r>
         <w:rPr>
-          <w:lang w:val="es-CO"/>
+          <w:noProof/>
+          <w:lang w:val="en-US" w:eastAsia="en-US"/>
         </w:rPr>
         <w:lastRenderedPageBreak/>
         <w:drawing>
@@ -10796,7 +10800,8 @@
       </w:pPr>
       <w:r>
         <w:rPr>
-          <w:lang w:val="es-CO"/>
+          <w:noProof/>
+          <w:lang w:val="en-US" w:eastAsia="en-US"/>
         </w:rPr>
         <w:drawing>
           <wp:inline distT="0" distB="0" distL="0" distR="0" wp14:anchorId="249F8425" wp14:editId="169D420E">
@@ -10852,7 +10857,8 @@
       </w:pPr>
       <w:r>
         <w:rPr>
-          <w:lang w:val="es-CO"/>
+          <w:noProof/>
+          <w:lang w:val="en-US" w:eastAsia="en-US"/>
         </w:rPr>
         <w:lastRenderedPageBreak/>
         <w:drawing>
@@ -10941,7 +10947,8 @@
       </w:pPr>
       <w:r>
         <w:rPr>
-          <w:lang w:val="es-CO"/>
+          <w:noProof/>
+          <w:lang w:val="en-US" w:eastAsia="en-US"/>
         </w:rPr>
         <w:drawing>
           <wp:inline distT="0" distB="0" distL="0" distR="0" wp14:anchorId="2CEF1B26" wp14:editId="6BF15E17">
@@ -11143,7 +11150,8 @@
       </w:pPr>
       <w:r>
         <w:rPr>
-          <w:lang w:val="es-CO"/>
+          <w:noProof/>
+          <w:lang w:val="en-US" w:eastAsia="en-US"/>
         </w:rPr>
         <w:drawing>
           <wp:inline distT="0" distB="0" distL="0" distR="0" wp14:anchorId="25B377AB" wp14:editId="71029064">
@@ -11190,7 +11198,8 @@
       </w:pPr>
       <w:r>
         <w:rPr>
-          <w:lang w:val="es-CO"/>
+          <w:noProof/>
+          <w:lang w:val="en-US" w:eastAsia="en-US"/>
         </w:rPr>
         <w:drawing>
           <wp:inline distT="0" distB="0" distL="0" distR="0" wp14:anchorId="0A6A5227" wp14:editId="2BDE6588">
@@ -11371,6 +11380,10 @@
         <w:jc w:val="center"/>
       </w:pPr>
       <w:r>
+        <w:rPr>
+          <w:noProof/>
+          <w:lang w:val="en-US" w:eastAsia="en-US"/>
+        </w:rPr>
         <w:drawing>
           <wp:inline distT="0" distB="0" distL="0" distR="0" wp14:anchorId="0DE9D133" wp14:editId="5E0B4D3E">
             <wp:extent cx="3061642" cy="4429125"/>
@@ -11420,6 +11433,10 @@
         <w:jc w:val="center"/>
       </w:pPr>
       <w:r>
+        <w:rPr>
+          <w:noProof/>
+          <w:lang w:val="en-US" w:eastAsia="en-US"/>
+        </w:rPr>
         <w:lastRenderedPageBreak/>
         <w:drawing>
           <wp:inline distT="0" distB="0" distL="0" distR="0" wp14:anchorId="729F3ACE" wp14:editId="619FF7A1">
@@ -11476,6 +11493,10 @@
         <w:jc w:val="center"/>
       </w:pPr>
       <w:r>
+        <w:rPr>
+          <w:noProof/>
+          <w:lang w:val="en-US" w:eastAsia="en-US"/>
+        </w:rPr>
         <w:drawing>
           <wp:inline distT="0" distB="0" distL="0" distR="0" wp14:anchorId="50EBD300" wp14:editId="020A75FB">
             <wp:extent cx="5612130" cy="787400"/>
@@ -11518,6 +11539,10 @@
         <w:jc w:val="center"/>
       </w:pPr>
       <w:r>
+        <w:rPr>
+          <w:noProof/>
+          <w:lang w:val="en-US" w:eastAsia="en-US"/>
+        </w:rPr>
         <w:lastRenderedPageBreak/>
         <w:drawing>
           <wp:inline distT="0" distB="0" distL="0" distR="0" wp14:anchorId="665CBC87" wp14:editId="0EB9768B">
@@ -11580,6 +11605,10 @@
     <w:p/>
     <w:p>
       <w:r>
+        <w:rPr>
+          <w:noProof/>
+          <w:lang w:val="en-US" w:eastAsia="en-US"/>
+        </w:rPr>
         <w:drawing>
           <wp:inline distT="0" distB="0" distL="0" distR="0" wp14:anchorId="7C056166" wp14:editId="75767B04">
             <wp:extent cx="5612130" cy="1412240"/>
@@ -11638,6 +11667,10 @@
         <w:jc w:val="center"/>
       </w:pPr>
       <w:r>
+        <w:rPr>
+          <w:noProof/>
+          <w:lang w:val="en-US" w:eastAsia="en-US"/>
+        </w:rPr>
         <w:lastRenderedPageBreak/>
         <w:drawing>
           <wp:inline distT="0" distB="0" distL="0" distR="0" wp14:anchorId="5D5A371F" wp14:editId="6901850A">
@@ -11718,6 +11751,10 @@
         <w:jc w:val="center"/>
       </w:pPr>
       <w:r>
+        <w:rPr>
+          <w:noProof/>
+          <w:lang w:val="en-US" w:eastAsia="en-US"/>
+        </w:rPr>
         <w:drawing>
           <wp:inline distT="0" distB="0" distL="0" distR="0" wp14:anchorId="7A59B63B" wp14:editId="5EB10153">
             <wp:extent cx="5029200" cy="2385996"/>
@@ -11760,6 +11797,10 @@
         <w:jc w:val="center"/>
       </w:pPr>
       <w:r>
+        <w:rPr>
+          <w:noProof/>
+          <w:lang w:val="en-US" w:eastAsia="en-US"/>
+        </w:rPr>
         <w:lastRenderedPageBreak/>
         <w:drawing>
           <wp:inline distT="0" distB="0" distL="0" distR="0" wp14:anchorId="478CABC9" wp14:editId="7AA727AA">
@@ -11834,6 +11875,10 @@
         <w:jc w:val="center"/>
       </w:pPr>
       <w:r>
+        <w:rPr>
+          <w:noProof/>
+          <w:lang w:val="en-US" w:eastAsia="en-US"/>
+        </w:rPr>
         <w:lastRenderedPageBreak/>
         <w:drawing>
           <wp:inline distT="0" distB="0" distL="0" distR="0" wp14:anchorId="79A9A94E" wp14:editId="7CD0FB9C">
@@ -11877,6 +11922,10 @@
         <w:jc w:val="center"/>
       </w:pPr>
       <w:r>
+        <w:rPr>
+          <w:noProof/>
+          <w:lang w:val="en-US" w:eastAsia="en-US"/>
+        </w:rPr>
         <w:drawing>
           <wp:inline distT="0" distB="0" distL="0" distR="0" wp14:anchorId="78518DA0" wp14:editId="6BB31A00">
             <wp:extent cx="3711969" cy="3600450"/>
@@ -11936,6 +11985,10 @@
         <w:jc w:val="center"/>
       </w:pPr>
       <w:r>
+        <w:rPr>
+          <w:noProof/>
+          <w:lang w:val="en-US" w:eastAsia="en-US"/>
+        </w:rPr>
         <w:drawing>
           <wp:inline distT="0" distB="0" distL="0" distR="0" wp14:anchorId="50F95AF9" wp14:editId="0923EEBB">
             <wp:extent cx="3534268" cy="1038370"/>
@@ -12064,6 +12117,10 @@
         <w:jc w:val="center"/>
       </w:pPr>
       <w:r>
+        <w:rPr>
+          <w:noProof/>
+          <w:lang w:val="en-US" w:eastAsia="en-US"/>
+        </w:rPr>
         <w:drawing>
           <wp:inline distT="0" distB="0" distL="0" distR="0" wp14:anchorId="428A4178" wp14:editId="4CFE61A6">
             <wp:extent cx="3019425" cy="2935784"/>
@@ -12135,6 +12192,10 @@
         <w:jc w:val="center"/>
       </w:pPr>
       <w:r>
+        <w:rPr>
+          <w:noProof/>
+          <w:lang w:val="en-US" w:eastAsia="en-US"/>
+        </w:rPr>
         <w:lastRenderedPageBreak/>
         <w:drawing>
           <wp:inline distT="0" distB="0" distL="0" distR="0" wp14:anchorId="55F4FAF7" wp14:editId="324CB185">
@@ -12195,6 +12256,10 @@
         <w:jc w:val="center"/>
       </w:pPr>
       <w:r>
+        <w:rPr>
+          <w:noProof/>
+          <w:lang w:val="en-US" w:eastAsia="en-US"/>
+        </w:rPr>
         <w:drawing>
           <wp:inline distT="0" distB="0" distL="0" distR="0" wp14:anchorId="43430259" wp14:editId="7CBDF1A9">
             <wp:extent cx="2850332" cy="2924175"/>
@@ -12280,6 +12345,10 @@
         <w:jc w:val="center"/>
       </w:pPr>
       <w:r>
+        <w:rPr>
+          <w:noProof/>
+          <w:lang w:val="en-US" w:eastAsia="en-US"/>
+        </w:rPr>
         <w:lastRenderedPageBreak/>
         <w:drawing>
           <wp:inline distT="0" distB="0" distL="0" distR="0" wp14:anchorId="1DECDEBA" wp14:editId="232942A4">
@@ -12328,6 +12397,10 @@
         <w:jc w:val="center"/>
       </w:pPr>
       <w:r>
+        <w:rPr>
+          <w:noProof/>
+          <w:lang w:val="en-US" w:eastAsia="en-US"/>
+        </w:rPr>
         <w:drawing>
           <wp:inline distT="0" distB="0" distL="0" distR="0" wp14:anchorId="00EE427B" wp14:editId="4F79254D">
             <wp:extent cx="2933838" cy="4038600"/>
@@ -12386,6 +12459,10 @@
         <w:jc w:val="center"/>
       </w:pPr>
       <w:r>
+        <w:rPr>
+          <w:noProof/>
+          <w:lang w:val="en-US" w:eastAsia="en-US"/>
+        </w:rPr>
         <w:drawing>
           <wp:inline distT="0" distB="0" distL="0" distR="0" wp14:anchorId="7598D2C9" wp14:editId="02DB7032">
             <wp:extent cx="4220164" cy="666843"/>
@@ -12433,6 +12510,10 @@
         <w:jc w:val="center"/>
       </w:pPr>
       <w:r>
+        <w:rPr>
+          <w:noProof/>
+          <w:lang w:val="en-US" w:eastAsia="en-US"/>
+        </w:rPr>
         <w:drawing>
           <wp:inline distT="0" distB="0" distL="0" distR="0" wp14:anchorId="376BD55A" wp14:editId="3EE4B776">
             <wp:extent cx="3905795" cy="1971950"/>
@@ -12488,6 +12569,10 @@
         <w:jc w:val="center"/>
       </w:pPr>
       <w:r>
+        <w:rPr>
+          <w:noProof/>
+          <w:lang w:val="en-US" w:eastAsia="en-US"/>
+        </w:rPr>
         <w:drawing>
           <wp:inline distT="0" distB="0" distL="0" distR="0" wp14:anchorId="675F0B92" wp14:editId="444BDAD9">
             <wp:extent cx="3705742" cy="1905266"/>
@@ -12535,6 +12620,10 @@
         <w:jc w:val="center"/>
       </w:pPr>
       <w:r>
+        <w:rPr>
+          <w:noProof/>
+          <w:lang w:val="en-US" w:eastAsia="en-US"/>
+        </w:rPr>
         <w:lastRenderedPageBreak/>
         <w:drawing>
           <wp:inline distT="0" distB="0" distL="0" distR="0" wp14:anchorId="2D178582" wp14:editId="7A699B6C">
@@ -12685,6 +12774,10 @@
     </w:p>
     <w:p>
       <w:r>
+        <w:rPr>
+          <w:noProof/>
+          <w:lang w:val="en-US" w:eastAsia="en-US"/>
+        </w:rPr>
         <w:drawing>
           <wp:inline distT="0" distB="0" distL="0" distR="0" wp14:anchorId="407C7E36" wp14:editId="0302C0C0">
             <wp:extent cx="3305175" cy="822057"/>
@@ -12729,6 +12822,10 @@
     </w:p>
     <w:p>
       <w:r>
+        <w:rPr>
+          <w:noProof/>
+          <w:lang w:val="en-US" w:eastAsia="en-US"/>
+        </w:rPr>
         <w:drawing>
           <wp:inline distT="0" distB="0" distL="0" distR="0" wp14:anchorId="1BA94524" wp14:editId="47CE432E">
             <wp:extent cx="5612130" cy="1006475"/>
@@ -12768,6 +12865,10 @@
     </w:p>
     <w:p>
       <w:r>
+        <w:rPr>
+          <w:noProof/>
+          <w:lang w:val="en-US" w:eastAsia="en-US"/>
+        </w:rPr>
         <w:lastRenderedPageBreak/>
         <w:drawing>
           <wp:inline distT="0" distB="0" distL="0" distR="0" wp14:anchorId="4EF42908" wp14:editId="07D6F246">
@@ -12814,6 +12915,10 @@
     </w:p>
     <w:p>
       <w:r>
+        <w:rPr>
+          <w:noProof/>
+          <w:lang w:val="en-US" w:eastAsia="en-US"/>
+        </w:rPr>
         <w:drawing>
           <wp:inline distT="0" distB="0" distL="0" distR="0" wp14:anchorId="5C191D27" wp14:editId="4A804413">
             <wp:extent cx="5612130" cy="1310640"/>
@@ -12878,6 +12983,10 @@
     </w:p>
     <w:p>
       <w:r>
+        <w:rPr>
+          <w:noProof/>
+          <w:lang w:val="en-US" w:eastAsia="en-US"/>
+        </w:rPr>
         <w:drawing>
           <wp:inline distT="0" distB="0" distL="0" distR="0" wp14:anchorId="35C05DC0" wp14:editId="2FD96837">
             <wp:extent cx="5612130" cy="2148840"/>
@@ -12956,6 +13065,8 @@
       <w:r>
         <w:rPr>
           <w:b/>
+          <w:noProof/>
+          <w:lang w:val="en-US" w:eastAsia="en-US"/>
         </w:rPr>
         <w:lastRenderedPageBreak/>
         <w:drawing>
@@ -13005,6 +13116,8 @@
       <w:r>
         <w:rPr>
           <w:b/>
+          <w:noProof/>
+          <w:lang w:val="en-US" w:eastAsia="en-US"/>
         </w:rPr>
         <w:drawing>
           <wp:inline distT="0" distB="0" distL="0" distR="0" wp14:anchorId="5719AD89" wp14:editId="0F233E22">
@@ -13107,6 +13220,10 @@
     <w:p/>
     <w:p>
       <w:r>
+        <w:rPr>
+          <w:noProof/>
+          <w:lang w:val="en-US" w:eastAsia="en-US"/>
+        </w:rPr>
         <w:lastRenderedPageBreak/>
         <w:drawing>
           <wp:inline distT="0" distB="0" distL="0" distR="0" wp14:anchorId="56135E44" wp14:editId="40142E38">
@@ -13203,6 +13320,10 @@
     <w:p/>
     <w:p>
       <w:r>
+        <w:rPr>
+          <w:noProof/>
+          <w:lang w:val="en-US" w:eastAsia="en-US"/>
+        </w:rPr>
         <w:drawing>
           <wp:inline distT="0" distB="0" distL="0" distR="0" wp14:anchorId="613DFA2D" wp14:editId="21B37667">
             <wp:extent cx="4124901" cy="3743847"/>
@@ -13279,6 +13400,10 @@
     <w:p/>
     <w:p>
       <w:r>
+        <w:rPr>
+          <w:noProof/>
+          <w:lang w:val="en-US" w:eastAsia="en-US"/>
+        </w:rPr>
         <w:drawing>
           <wp:inline distT="0" distB="0" distL="0" distR="0" wp14:anchorId="7CD21007" wp14:editId="21BDC8BE">
             <wp:extent cx="5612130" cy="4112895"/>
@@ -13383,6 +13508,10 @@
         <w:jc w:val="center"/>
       </w:pPr>
       <w:r>
+        <w:rPr>
+          <w:noProof/>
+          <w:lang w:val="en-US" w:eastAsia="en-US"/>
+        </w:rPr>
         <w:lastRenderedPageBreak/>
         <w:drawing>
           <wp:inline distT="0" distB="0" distL="0" distR="0" wp14:anchorId="08CADF98" wp14:editId="69F07108">
@@ -13432,6 +13561,10 @@
         <w:jc w:val="center"/>
       </w:pPr>
       <w:r>
+        <w:rPr>
+          <w:noProof/>
+          <w:lang w:val="en-US" w:eastAsia="en-US"/>
+        </w:rPr>
         <w:drawing>
           <wp:inline distT="0" distB="0" distL="0" distR="0" wp14:anchorId="482D1D31" wp14:editId="05C5C01D">
             <wp:extent cx="3905250" cy="3329066"/>
@@ -13509,6 +13642,10 @@
         <w:jc w:val="center"/>
       </w:pPr>
       <w:r>
+        <w:rPr>
+          <w:noProof/>
+          <w:lang w:val="en-US" w:eastAsia="en-US"/>
+        </w:rPr>
         <w:drawing>
           <wp:inline distT="0" distB="0" distL="0" distR="0" wp14:anchorId="0E67CDD0" wp14:editId="3F4F5DA9">
             <wp:extent cx="5612130" cy="3199130"/>
@@ -13551,6 +13688,10 @@
         <w:jc w:val="center"/>
       </w:pPr>
       <w:r>
+        <w:rPr>
+          <w:noProof/>
+          <w:lang w:val="en-US" w:eastAsia="en-US"/>
+        </w:rPr>
         <w:drawing>
           <wp:inline distT="0" distB="0" distL="0" distR="0" wp14:anchorId="62C8DF9A" wp14:editId="4F371486">
             <wp:extent cx="5612130" cy="3811270"/>
@@ -13620,6 +13761,10 @@
     </w:p>
     <w:p>
       <w:r>
+        <w:rPr>
+          <w:noProof/>
+          <w:lang w:val="en-US" w:eastAsia="en-US"/>
+        </w:rPr>
         <w:drawing>
           <wp:inline distT="0" distB="0" distL="0" distR="0" wp14:anchorId="0F1B4302" wp14:editId="23E64D8A">
             <wp:extent cx="5612130" cy="979170"/>
@@ -13662,6 +13807,10 @@
         <w:jc w:val="center"/>
       </w:pPr>
       <w:r>
+        <w:rPr>
+          <w:noProof/>
+          <w:lang w:val="en-US" w:eastAsia="en-US"/>
+        </w:rPr>
         <w:drawing>
           <wp:inline distT="0" distB="0" distL="0" distR="0" wp14:anchorId="5539683F" wp14:editId="16610CCF">
             <wp:extent cx="3248025" cy="2219200"/>
@@ -13704,6 +13853,10 @@
         <w:jc w:val="center"/>
       </w:pPr>
       <w:r>
+        <w:rPr>
+          <w:noProof/>
+          <w:lang w:val="en-US" w:eastAsia="en-US"/>
+        </w:rPr>
         <w:drawing>
           <wp:inline distT="0" distB="0" distL="0" distR="0" wp14:anchorId="24352576" wp14:editId="25EAE58D">
             <wp:extent cx="5612130" cy="2891790"/>
@@ -13776,6 +13929,10 @@
         <w:jc w:val="center"/>
       </w:pPr>
       <w:r>
+        <w:rPr>
+          <w:noProof/>
+          <w:lang w:val="en-US" w:eastAsia="en-US"/>
+        </w:rPr>
         <w:drawing>
           <wp:inline distT="0" distB="0" distL="0" distR="0" wp14:anchorId="3F752937" wp14:editId="0CBAF867">
             <wp:extent cx="5612130" cy="2371725"/>
@@ -13867,6 +14024,10 @@
         <w:jc w:val="center"/>
       </w:pPr>
       <w:r>
+        <w:rPr>
+          <w:noProof/>
+          <w:lang w:val="en-US" w:eastAsia="en-US"/>
+        </w:rPr>
         <w:drawing>
           <wp:inline distT="0" distB="0" distL="0" distR="0" wp14:anchorId="7BD83D96" wp14:editId="31BFB035">
             <wp:extent cx="5612130" cy="1960245"/>
@@ -13919,6 +14080,10 @@
         <w:jc w:val="center"/>
       </w:pPr>
       <w:r>
+        <w:rPr>
+          <w:noProof/>
+          <w:lang w:val="en-US" w:eastAsia="en-US"/>
+        </w:rPr>
         <w:lastRenderedPageBreak/>
         <w:drawing>
           <wp:inline distT="0" distB="0" distL="0" distR="0" wp14:anchorId="3AB614B7" wp14:editId="1F68D0BA">
@@ -13959,6 +14124,10 @@
     </w:p>
     <w:p>
       <w:r>
+        <w:rPr>
+          <w:noProof/>
+          <w:lang w:val="en-US" w:eastAsia="en-US"/>
+        </w:rPr>
         <w:drawing>
           <wp:inline distT="0" distB="0" distL="0" distR="0" wp14:anchorId="1717D09C" wp14:editId="12F67BDE">
             <wp:extent cx="5612130" cy="2303780"/>
@@ -14020,6 +14189,10 @@
         <w:jc w:val="center"/>
       </w:pPr>
       <w:r>
+        <w:rPr>
+          <w:noProof/>
+          <w:lang w:val="en-US" w:eastAsia="en-US"/>
+        </w:rPr>
         <w:lastRenderedPageBreak/>
         <w:drawing>
           <wp:inline distT="0" distB="0" distL="0" distR="0" wp14:anchorId="21D7BFE4" wp14:editId="6CE9511C">
@@ -14079,6 +14252,10 @@
         <w:jc w:val="center"/>
       </w:pPr>
       <w:r>
+        <w:rPr>
+          <w:noProof/>
+          <w:lang w:val="en-US" w:eastAsia="en-US"/>
+        </w:rPr>
         <w:drawing>
           <wp:inline distT="0" distB="0" distL="0" distR="0" wp14:anchorId="4A6EE6DB" wp14:editId="74D095F2">
             <wp:extent cx="4669169" cy="3685991"/>
@@ -14117,8 +14294,294 @@
       </w:r>
     </w:p>
     <w:p>
+      <w:pPr>
+        <w:pStyle w:val="Ttulo1"/>
+        <w:jc w:val="center"/>
+        <w:rPr>
+          <w:rFonts w:ascii="Arial" w:hAnsi="Arial" w:cs="Arial"/>
+          <w:b/>
+          <w:sz w:val="24"/>
+          <w:szCs w:val="24"/>
+          <w:lang w:val="es-MX"/>
+        </w:rPr>
+      </w:pPr>
+      <w:r>
+        <w:rPr>
+          <w:rFonts w:ascii="Arial" w:hAnsi="Arial" w:cs="Arial"/>
+          <w:b/>
+          <w:sz w:val="24"/>
+          <w:szCs w:val="24"/>
+          <w:lang w:val="es-MX"/>
+        </w:rPr>
+        <w:lastRenderedPageBreak/>
+        <w:t xml:space="preserve">Sección 5: Profundizando en </w:t>
+      </w:r>
+      <w:proofErr w:type="gramStart"/>
+      <w:r>
+        <w:rPr>
+          <w:rFonts w:ascii="Arial" w:hAnsi="Arial" w:cs="Arial"/>
+          <w:b/>
+          <w:sz w:val="24"/>
+          <w:szCs w:val="24"/>
+          <w:lang w:val="es-MX"/>
+        </w:rPr>
+        <w:t>las  Operaciones</w:t>
+      </w:r>
+      <w:proofErr w:type="gramEnd"/>
+      <w:r>
+        <w:rPr>
+          <w:rFonts w:ascii="Arial" w:hAnsi="Arial" w:cs="Arial"/>
+          <w:b/>
+          <w:sz w:val="24"/>
+          <w:szCs w:val="24"/>
+          <w:lang w:val="es-MX"/>
+        </w:rPr>
+        <w:t xml:space="preserve"> “</w:t>
+      </w:r>
+      <w:proofErr w:type="spellStart"/>
+      <w:r>
+        <w:rPr>
+          <w:rFonts w:ascii="Arial" w:hAnsi="Arial" w:cs="Arial"/>
+          <w:b/>
+          <w:sz w:val="24"/>
+          <w:szCs w:val="24"/>
+          <w:lang w:val="es-MX"/>
+        </w:rPr>
+        <w:t>Create</w:t>
+      </w:r>
+      <w:proofErr w:type="spellEnd"/>
+      <w:r>
+        <w:rPr>
+          <w:rFonts w:ascii="Arial" w:hAnsi="Arial" w:cs="Arial"/>
+          <w:b/>
+          <w:sz w:val="24"/>
+          <w:szCs w:val="24"/>
+          <w:lang w:val="es-MX"/>
+        </w:rPr>
+        <w:t>”</w:t>
+      </w:r>
+    </w:p>
+    <w:p>
+      <w:pPr>
+        <w:rPr>
+          <w:lang w:val="es-MX"/>
+        </w:rPr>
+      </w:pPr>
+    </w:p>
+    <w:p>
+      <w:pPr>
+        <w:pStyle w:val="Ttulo2"/>
+        <w:rPr>
+          <w:b/>
+          <w:lang w:val="es-MX"/>
+        </w:rPr>
+      </w:pPr>
+      <w:r>
+        <w:rPr>
+          <w:b/>
+          <w:lang w:val="es-MX"/>
+        </w:rPr>
+        <w:t xml:space="preserve">43. Crear documentos en </w:t>
+      </w:r>
+      <w:proofErr w:type="spellStart"/>
+      <w:r>
+        <w:rPr>
+          <w:b/>
+          <w:lang w:val="es-MX"/>
+        </w:rPr>
+        <w:t>MongoDB</w:t>
+      </w:r>
+      <w:proofErr w:type="spellEnd"/>
+    </w:p>
+    <w:p>
+      <w:pPr>
+        <w:rPr>
+          <w:lang w:val="es-MX"/>
+        </w:rPr>
+      </w:pPr>
+    </w:p>
+    <w:p>
+      <w:pPr>
+        <w:jc w:val="center"/>
+        <w:rPr>
+          <w:lang w:val="es-MX"/>
+        </w:rPr>
+      </w:pPr>
+      <w:r>
+        <w:rPr>
+          <w:lang w:val="es-MX"/>
+        </w:rPr>
+        <w:drawing>
+          <wp:inline distT="0" distB="0" distL="0" distR="0" wp14:anchorId="47F8A985" wp14:editId="4721C5E1">
+            <wp:extent cx="5612130" cy="3266440"/>
+            <wp:effectExtent l="0" t="0" r="7620" b="0"/>
+            <wp:docPr id="162" name="Imagen 162"/>
+            <wp:cNvGraphicFramePr>
+              <a:graphicFrameLocks xmlns:a="http://schemas.openxmlformats.org/drawingml/2006/main" noChangeAspect="1"/>
+            </wp:cNvGraphicFramePr>
+            <a:graphic xmlns:a="http://schemas.openxmlformats.org/drawingml/2006/main">
+              <a:graphicData uri="http://schemas.openxmlformats.org/drawingml/2006/picture">
+                <pic:pic xmlns:pic="http://schemas.openxmlformats.org/drawingml/2006/picture">
+                  <pic:nvPicPr>
+                    <pic:cNvPr id="1" name=""/>
+                    <pic:cNvPicPr/>
+                  </pic:nvPicPr>
+                  <pic:blipFill>
+                    <a:blip r:embed="rId121"/>
+                    <a:stretch>
+                      <a:fillRect/>
+                    </a:stretch>
+                  </pic:blipFill>
+                  <pic:spPr>
+                    <a:xfrm>
+                      <a:off x="0" y="0"/>
+                      <a:ext cx="5612130" cy="3266440"/>
+                    </a:xfrm>
+                    <a:prstGeom prst="rect">
+                      <a:avLst/>
+                    </a:prstGeom>
+                  </pic:spPr>
+                </pic:pic>
+              </a:graphicData>
+            </a:graphic>
+          </wp:inline>
+        </w:drawing>
+      </w:r>
+    </w:p>
+    <w:p>
+      <w:pPr>
+        <w:pStyle w:val="Ttulo2"/>
+        <w:rPr>
+          <w:b/>
+        </w:rPr>
+      </w:pPr>
+      <w:r>
+        <w:rPr>
+          <w:b/>
+        </w:rPr>
+        <w:t xml:space="preserve">44. Aprendiendo los </w:t>
+      </w:r>
+      <w:proofErr w:type="spellStart"/>
+      <w:r>
+        <w:rPr>
+          <w:b/>
+        </w:rPr>
+        <w:t>metodos</w:t>
+      </w:r>
+      <w:proofErr w:type="spellEnd"/>
+      <w:r>
+        <w:rPr>
+          <w:b/>
+        </w:rPr>
+        <w:t xml:space="preserve"> “</w:t>
+      </w:r>
+      <w:proofErr w:type="spellStart"/>
+      <w:proofErr w:type="gramStart"/>
+      <w:r>
+        <w:rPr>
+          <w:b/>
+        </w:rPr>
+        <w:t>insert</w:t>
+      </w:r>
+      <w:proofErr w:type="spellEnd"/>
+      <w:r>
+        <w:rPr>
+          <w:b/>
+        </w:rPr>
+        <w:t>(</w:t>
+      </w:r>
+      <w:proofErr w:type="gramEnd"/>
+      <w:r>
+        <w:rPr>
+          <w:b/>
+        </w:rPr>
+        <w:t>)</w:t>
+      </w:r>
+      <w:r>
+        <w:rPr>
+          <w:b/>
+        </w:rPr>
+        <w:t>”</w:t>
+      </w:r>
+    </w:p>
+    <w:p/>
+    <w:p>
+      <w:r>
+        <w:drawing>
+          <wp:inline distT="0" distB="0" distL="0" distR="0" wp14:anchorId="3B2E25E0" wp14:editId="2187D8C0">
+            <wp:extent cx="5612130" cy="2153285"/>
+            <wp:effectExtent l="0" t="0" r="7620" b="0"/>
+            <wp:docPr id="209" name="Imagen 209"/>
+            <wp:cNvGraphicFramePr>
+              <a:graphicFrameLocks xmlns:a="http://schemas.openxmlformats.org/drawingml/2006/main" noChangeAspect="1"/>
+            </wp:cNvGraphicFramePr>
+            <a:graphic xmlns:a="http://schemas.openxmlformats.org/drawingml/2006/main">
+              <a:graphicData uri="http://schemas.openxmlformats.org/drawingml/2006/picture">
+                <pic:pic xmlns:pic="http://schemas.openxmlformats.org/drawingml/2006/picture">
+                  <pic:nvPicPr>
+                    <pic:cNvPr id="1" name=""/>
+                    <pic:cNvPicPr/>
+                  </pic:nvPicPr>
+                  <pic:blipFill>
+                    <a:blip r:embed="rId122"/>
+                    <a:stretch>
+                      <a:fillRect/>
+                    </a:stretch>
+                  </pic:blipFill>
+                  <pic:spPr>
+                    <a:xfrm>
+                      <a:off x="0" y="0"/>
+                      <a:ext cx="5612130" cy="2153285"/>
+                    </a:xfrm>
+                    <a:prstGeom prst="rect">
+                      <a:avLst/>
+                    </a:prstGeom>
+                  </pic:spPr>
+                </pic:pic>
+              </a:graphicData>
+            </a:graphic>
+          </wp:inline>
+        </w:drawing>
+      </w:r>
+    </w:p>
+    <w:p/>
+    <w:p>
+      <w:r>
+        <w:t>Min: 4:44</w:t>
+      </w:r>
       <w:bookmarkStart w:id="56" w:name="_GoBack"/>
       <w:bookmarkEnd w:id="56"/>
+    </w:p>
+    <w:p/>
+    <w:p>
+      <w:pPr>
+        <w:rPr>
+          <w:lang w:val="es-MX"/>
+        </w:rPr>
+      </w:pPr>
+    </w:p>
+    <w:p>
+      <w:pPr>
+        <w:rPr>
+          <w:lang w:val="es-MX"/>
+        </w:rPr>
+      </w:pPr>
+    </w:p>
+    <w:p>
+      <w:pPr>
+        <w:rPr>
+          <w:lang w:val="es-MX"/>
+        </w:rPr>
+      </w:pPr>
+    </w:p>
+    <w:p>
+      <w:pPr>
+        <w:pStyle w:val="Ttulo1"/>
+        <w:rPr>
+          <w:b/>
+          <w:lang w:val="es-MX"/>
+        </w:rPr>
+      </w:pPr>
     </w:p>
     <w:p/>
     <w:p/>
@@ -14240,7 +14703,7 @@
       </w:pPr>
     </w:p>
     <w:sectPr>
-      <w:footerReference w:type="default" r:id="rId121"/>
+      <w:footerReference w:type="default" r:id="rId123"/>
       <w:pgSz w:w="12240" w:h="15840"/>
       <w:pgMar w:top="1417" w:right="1701" w:bottom="1417" w:left="1701" w:header="708" w:footer="708" w:gutter="0"/>
       <w:cols w:space="708"/>
@@ -14314,7 +14777,7 @@
           <w:rPr>
             <w:noProof/>
           </w:rPr>
-          <w:t>54</w:t>
+          <w:t>57</w:t>
         </w:r>
         <w:r>
           <w:fldChar w:fldCharType="end"/>
@@ -17743,7 +18206,7 @@
 </file>
 
 <file path=customXml/itemProps1.xml><?xml version="1.0" encoding="utf-8"?>
-<ds:datastoreItem xmlns:ds="http://schemas.openxmlformats.org/officeDocument/2006/customXml" ds:itemID="{A7414FC7-D9F3-42D2-B966-5955F3CAAD10}">
+<ds:datastoreItem xmlns:ds="http://schemas.openxmlformats.org/officeDocument/2006/customXml" ds:itemID="{B3954224-C81F-4E4E-874A-072ECCADB77C}">
   <ds:schemaRefs>
     <ds:schemaRef ds:uri="http://schemas.openxmlformats.org/officeDocument/2006/bibliography"/>
   </ds:schemaRefs>

</xml_diff>